<commit_message>
docs(srs): attach official Google Drive submission link across all SRS deliverable documents
</commit_message>
<xml_diff>
--- a/Resources/SRS_UNIVERSITY_SUBMISSION.docx
+++ b/Resources/SRS_UNIVERSITY_SUBMISSION.docx
@@ -967,6 +967,63 @@
                 <w:szCs w:val="20"/>
               </w:rPr>
               <w:t xml:space="preserve">Next.js 14+ (App Router, TypeScript), Node.js 22 LTS, PostgreSQL 16 (Neon), Cloudflare R2, OpenPGP.js v6</w:t>
+            </w:r>
+          </w:p>
+        </w:tc>
+      </w:tr>
+      <w:tr>
+        <w:trPr/>
+        <w:tc>
+          <w:tcPr>
+            <w:tcW w:w="2600" w:type="dxa"/>
+            <w:shd w:val="clear" w:color="auto" w:fill="FFFFFF"/>
+            <w:vAlign w:val="top"/>
+          </w:tcPr>
+          <w:p>
+            <w:pPr>
+              <w:spacing w:before="30" w:after="30" w:line="240" w:lineRule="auto"/>
+              <w:jc w:val="left"/>
+            </w:pPr>
+            <w:r>
+              <w:rPr>
+                <w:rFonts w:ascii="Times New Roman" w:cs="Times New Roman" w:eastAsia="Times New Roman" w:hAnsi="Times New Roman"/>
+                <w:b/>
+                <w:bCs/>
+                <w:i w:val="0"/>
+                <w:iCs w:val="0"/>
+                <w:u w:val="none"/>
+                <w:color w:val="000000"/>
+                <w:sz w:val="20"/>
+                <w:szCs w:val="20"/>
+              </w:rPr>
+              <w:t xml:space="preserve">Google Drive Document Link</w:t>
+            </w:r>
+          </w:p>
+        </w:tc>
+        <w:tc>
+          <w:tcPr>
+            <w:tcW w:w="6760" w:type="dxa"/>
+            <w:shd w:val="clear" w:color="auto" w:fill="FFFFFF"/>
+            <w:vAlign w:val="top"/>
+          </w:tcPr>
+          <w:p>
+            <w:pPr>
+              <w:spacing w:before="30" w:after="30" w:line="240" w:lineRule="auto"/>
+              <w:jc w:val="left"/>
+            </w:pPr>
+            <w:r>
+              <w:rPr>
+                <w:rFonts w:ascii="Times New Roman" w:cs="Times New Roman" w:eastAsia="Times New Roman" w:hAnsi="Times New Roman"/>
+                <w:b w:val="0"/>
+                <w:bCs w:val="0"/>
+                <w:i w:val="0"/>
+                <w:iCs w:val="0"/>
+                <w:u w:val="none"/>
+                <w:color w:val="000000"/>
+                <w:sz w:val="20"/>
+                <w:szCs w:val="20"/>
+              </w:rPr>
+              <w:t xml:space="preserve">View Software Requirements Specification (Google Drive) (https://docs.google.com/document/d/1n8VKmXeK4TSTPPR-mDXp3NkKwDxvzTzEWR9tgdZlxSg/edit?usp=drive_link)</w:t>
             </w:r>
           </w:p>
         </w:tc>

</xml_diff>